<commit_message>
Pantheon der 8 hinzugefügt
</commit_message>
<xml_diff>
--- a/docs/Buch Bayrische Nächte/Buch 6.docx
+++ b/docs/Buch Bayrische Nächte/Buch 6.docx
@@ -27,8 +27,13 @@
         <w:t>Die Ankunft der Helden</w:t>
       </w:r>
       <w:r>
-        <w:t xml:space="preserve"> und Vota</w:t>
-      </w:r>
+        <w:t xml:space="preserve"> und </w:t>
+      </w:r>
+      <w:proofErr w:type="spellStart"/>
+      <w:r>
+        <w:t>Vota</w:t>
+      </w:r>
+      <w:proofErr w:type="spellEnd"/>
       <w:r>
         <w:t xml:space="preserve"> als Vorboten der Öffnung der anderen Siegel auf einem weißen Schiff in Griechenland.</w:t>
       </w:r>
@@ -42,7 +47,15 @@
         </w:numPr>
       </w:pPr>
       <w:r>
-        <w:t>König Ludwig II. reitet auf einem roten Pferd über die Grenze zwischen Bayern und Württemberg bei Ulm. Er beginnt einen Krieg, fehlgeleitet und kontrolliert von den Harbingern.</w:t>
+        <w:t xml:space="preserve">König Ludwig II. reitet auf einem roten Pferd über die Grenze zwischen Bayern und Württemberg bei Ulm. Er beginnt einen Krieg, fehlgeleitet und kontrolliert von den </w:t>
+      </w:r>
+      <w:proofErr w:type="spellStart"/>
+      <w:r>
+        <w:t>Harbingern</w:t>
+      </w:r>
+      <w:proofErr w:type="spellEnd"/>
+      <w:r>
+        <w:t>.</w:t>
       </w:r>
     </w:p>
     <w:p>
@@ -54,7 +67,23 @@
         </w:numPr>
       </w:pPr>
       <w:r>
-        <w:t>Schwarze Züge transportieren Korn, welches hochgradig vergiftet ist. Überall im Land und angrenzend sterben Vieh and schlechtem Futter. Gemüse wächst nicht mehr und aufgrund des Krieges bleiben Lieferungen aus. Die Harbingers haben mit den Ashbringern die Ernten von deutschen Staaten vergiftet.</w:t>
+        <w:t xml:space="preserve">Schwarze Züge transportieren Korn, welches hochgradig vergiftet ist. Überall im Land und angrenzend sterben Vieh and schlechtem Futter. Gemüse wächst nicht mehr und aufgrund des Krieges bleiben Lieferungen aus. Die </w:t>
+      </w:r>
+      <w:proofErr w:type="spellStart"/>
+      <w:r>
+        <w:t>Harbingers</w:t>
+      </w:r>
+      <w:proofErr w:type="spellEnd"/>
+      <w:r>
+        <w:t xml:space="preserve"> haben mit den </w:t>
+      </w:r>
+      <w:proofErr w:type="spellStart"/>
+      <w:r>
+        <w:t>Ashbringern</w:t>
+      </w:r>
+      <w:proofErr w:type="spellEnd"/>
+      <w:r>
+        <w:t xml:space="preserve"> die Ernten von deutschen Staaten vergiftet.</w:t>
       </w:r>
     </w:p>
     <w:p>
@@ -78,12 +107,35 @@
         </w:numPr>
       </w:pPr>
       <w:r>
-        <w:t>Erneut werden in religiösen Gebäuden rund um die Welt die 8 Psalmen an den Decken gefunden. Dieses mal predigen die Priester den ersten Psalm in der Sprache der Hölle, unablässig bis sie vor Durst sterben.</w:t>
+        <w:t xml:space="preserve">Erneut werden in religiösen Gebäuden rund um die Welt die 8 Psalmen an den Decken gefunden. Dieses </w:t>
+      </w:r>
+      <w:proofErr w:type="spellStart"/>
+      <w:proofErr w:type="gramStart"/>
+      <w:r>
+        <w:t>mal</w:t>
+      </w:r>
+      <w:proofErr w:type="spellEnd"/>
+      <w:proofErr w:type="gramEnd"/>
+      <w:r>
+        <w:t xml:space="preserve"> predigen die Priester den ersten Psalm in der Sprache der Hölle, unablässig bis sie vor Durst sterben.</w:t>
       </w:r>
     </w:p>
     <w:p>
-      <w:r>
-        <w:t>Vota trifft sich mit den Ashbringern um ein Ende zu dem Chaos zu bringen.</w:t>
+      <w:proofErr w:type="spellStart"/>
+      <w:r>
+        <w:t>Vota</w:t>
+      </w:r>
+      <w:proofErr w:type="spellEnd"/>
+      <w:r>
+        <w:t xml:space="preserve"> trifft sich mit den </w:t>
+      </w:r>
+      <w:proofErr w:type="spellStart"/>
+      <w:r>
+        <w:t>Ashbringern</w:t>
+      </w:r>
+      <w:proofErr w:type="spellEnd"/>
+      <w:r>
+        <w:t xml:space="preserve"> um ein Ende zu dem Chaos zu bringen.</w:t>
       </w:r>
     </w:p>
     <w:p>
@@ -91,13 +143,34 @@
         <w:t>Der Teufel lockt</w:t>
       </w:r>
       <w:r>
-        <w:t xml:space="preserve"> mit den Harbingern</w:t>
-      </w:r>
-      <w:r>
-        <w:t xml:space="preserve"> Vota </w:t>
-      </w:r>
-      <w:r>
-        <w:t xml:space="preserve">und die Ashbringer </w:t>
+        <w:t xml:space="preserve"> mit den </w:t>
+      </w:r>
+      <w:proofErr w:type="spellStart"/>
+      <w:r>
+        <w:t>Harbingern</w:t>
+      </w:r>
+      <w:proofErr w:type="spellEnd"/>
+      <w:r>
+        <w:t xml:space="preserve"> </w:t>
+      </w:r>
+      <w:proofErr w:type="spellStart"/>
+      <w:r>
+        <w:t>Vota</w:t>
+      </w:r>
+      <w:proofErr w:type="spellEnd"/>
+      <w:r>
+        <w:t xml:space="preserve"> </w:t>
+      </w:r>
+      <w:r>
+        <w:t xml:space="preserve">und die </w:t>
+      </w:r>
+      <w:proofErr w:type="spellStart"/>
+      <w:r>
+        <w:t>Ashbringer</w:t>
+      </w:r>
+      <w:proofErr w:type="spellEnd"/>
+      <w:r>
+        <w:t xml:space="preserve"> </w:t>
       </w:r>
       <w:r>
         <w:t>in eine Falle und kann sich ihn einverleiben.</w:t>
@@ -317,8 +390,16 @@
         <w:rPr>
           <w:lang w:val="en-US"/>
         </w:rPr>
-        <w:t xml:space="preserve"> Na’al</w:t>
-      </w:r>
+        <w:t xml:space="preserve"> </w:t>
+      </w:r>
+      <w:proofErr w:type="spellStart"/>
+      <w:r>
+        <w:rPr>
+          <w:lang w:val="en-US"/>
+        </w:rPr>
+        <w:t>Na’al</w:t>
+      </w:r>
+      <w:proofErr w:type="spellEnd"/>
       <w:r>
         <w:rPr>
           <w:lang w:val="en-US"/>
@@ -337,8 +418,15 @@
           <w:lang w:val="en-US"/>
         </w:rPr>
         <w:tab/>
+      </w:r>
+      <w:proofErr w:type="spellStart"/>
+      <w:r>
+        <w:rPr>
+          <w:lang w:val="en-US"/>
+        </w:rPr>
         <w:t>Shiofthu'Mi</w:t>
       </w:r>
+      <w:proofErr w:type="spellEnd"/>
       <w:r>
         <w:rPr>
           <w:lang w:val="en-US"/>
@@ -411,12 +499,14 @@
         </w:rPr>
         <w:t xml:space="preserve"> wonders, build over generations. She had overseen it all, guided them to strife for the greatest expanse. And they all did follow her, her children that they were. Was this all enough? Was she at the end of her achievements? Nothing more to gain? </w:t>
       </w:r>
+      <w:proofErr w:type="spellStart"/>
       <w:r>
         <w:rPr>
           <w:lang w:val="en-US"/>
         </w:rPr>
         <w:t>Irnatrav'Ara</w:t>
       </w:r>
+      <w:proofErr w:type="spellEnd"/>
       <w:r>
         <w:rPr>
           <w:lang w:val="en-US"/>
@@ -477,12 +567,14 @@
         </w:rPr>
         <w:t xml:space="preserve">lives. </w:t>
       </w:r>
+      <w:proofErr w:type="spellStart"/>
       <w:r>
         <w:rPr>
           <w:lang w:val="en-US"/>
         </w:rPr>
         <w:t>Shiofthu'Mi</w:t>
       </w:r>
+      <w:proofErr w:type="spellEnd"/>
       <w:r>
         <w:rPr>
           <w:lang w:val="en-US"/>
@@ -545,12 +637,14 @@
         </w:rPr>
         <w:t xml:space="preserve">one another, what they had done to </w:t>
       </w:r>
+      <w:proofErr w:type="spellStart"/>
       <w:r>
         <w:rPr>
           <w:lang w:val="en-US"/>
         </w:rPr>
         <w:t>Naitro'Nai</w:t>
       </w:r>
+      <w:proofErr w:type="spellEnd"/>
       <w:r>
         <w:rPr>
           <w:lang w:val="en-US"/>
@@ -579,7 +673,35 @@
         <w:rPr>
           <w:lang w:val="en-US"/>
         </w:rPr>
-        <w:t xml:space="preserve"> what had been necessary, after he could not be contained, striving for more and more, killing more and more beings just for their souls. A meatgrinder of endless agony.</w:t>
+        <w:t xml:space="preserve"> what had been necessary, after he could not be contained, striving for </w:t>
+      </w:r>
+      <w:proofErr w:type="gramStart"/>
+      <w:r>
+        <w:rPr>
+          <w:lang w:val="en-US"/>
+        </w:rPr>
+        <w:t>more and more</w:t>
+      </w:r>
+      <w:proofErr w:type="gramEnd"/>
+      <w:r>
+        <w:rPr>
+          <w:lang w:val="en-US"/>
+        </w:rPr>
+        <w:t xml:space="preserve">, killing </w:t>
+      </w:r>
+      <w:proofErr w:type="gramStart"/>
+      <w:r>
+        <w:rPr>
+          <w:lang w:val="en-US"/>
+        </w:rPr>
+        <w:t>more and more</w:t>
+      </w:r>
+      <w:proofErr w:type="gramEnd"/>
+      <w:r>
+        <w:rPr>
+          <w:lang w:val="en-US"/>
+        </w:rPr>
+        <w:t xml:space="preserve"> beings just for their souls. A meatgrinder of endless agony.</w:t>
       </w:r>
       <w:r>
         <w:rPr>
@@ -599,7 +721,21 @@
           <w:lang w:val="en-US"/>
         </w:rPr>
         <w:tab/>
-        <w:t xml:space="preserve">She drew her wings back, and instead stepped on a shimmering white mist forming under each of her feet, appearing and vanishing with each of her steps. She strode over her city, her people below admiring their goddess as she wandered over their heads. She loved to stroll through their ranks, giving them hope and </w:t>
+        <w:t xml:space="preserve">She drew her wings back, and instead stepped on a shimmering white mist forming under each of her feet, </w:t>
+      </w:r>
+      <w:proofErr w:type="gramStart"/>
+      <w:r>
+        <w:rPr>
+          <w:lang w:val="en-US"/>
+        </w:rPr>
+        <w:t>appearing</w:t>
+      </w:r>
+      <w:proofErr w:type="gramEnd"/>
+      <w:r>
+        <w:rPr>
+          <w:lang w:val="en-US"/>
+        </w:rPr>
+        <w:t xml:space="preserve"> and vanishing with each of her steps. She strode over her city, her people below admiring their goddess as she wandered over their heads. She loved to stroll through their ranks, giving them hope and </w:t>
       </w:r>
       <w:r>
         <w:rPr>
@@ -627,12 +763,14 @@
         <w:lastRenderedPageBreak/>
         <w:tab/>
       </w:r>
+      <w:proofErr w:type="spellStart"/>
       <w:r>
         <w:rPr>
           <w:lang w:val="en-US"/>
         </w:rPr>
         <w:t>Omofy'Olrak</w:t>
       </w:r>
+      <w:proofErr w:type="spellEnd"/>
       <w:r>
         <w:rPr>
           <w:lang w:val="en-US"/>
@@ -657,12 +795,14 @@
         </w:rPr>
         <w:t xml:space="preserve"> had called for a meeting of the </w:t>
       </w:r>
+      <w:proofErr w:type="spellStart"/>
       <w:r>
         <w:rPr>
           <w:lang w:val="en-US"/>
         </w:rPr>
         <w:t>Shiof'Miari</w:t>
       </w:r>
+      <w:proofErr w:type="spellEnd"/>
       <w:r>
         <w:rPr>
           <w:lang w:val="en-US"/>
@@ -679,13 +819,41 @@
         <w:rPr>
           <w:lang w:val="en-US"/>
         </w:rPr>
-        <w:t xml:space="preserve"> First time when they could not decide on what to do with their newfound strength they had harnessed for a few generations. Such little time. And they had been so taken over by feelings, rash and unthinking. They were not able to come together, so they split and their tribe with them. Each went off in different directions, the continent vast enough for their own</w:t>
-      </w:r>
-      <w:r>
-        <w:rPr>
-          <w:lang w:val="en-US"/>
-        </w:rPr>
-        <w:t xml:space="preserve">, so much of Na’al covered by water, one they could not travers just yet. Each of the eight tribes spread and grew, so conflict had been </w:t>
+        <w:t xml:space="preserve"> First time when they could not decide on what to do with their newfound strength they had harnessed for a few generations. Such little time. And they had been so taken over by feelings, rash and unthinking. They </w:t>
+      </w:r>
+      <w:proofErr w:type="gramStart"/>
+      <w:r>
+        <w:rPr>
+          <w:lang w:val="en-US"/>
+        </w:rPr>
+        <w:t>were not able to</w:t>
+      </w:r>
+      <w:proofErr w:type="gramEnd"/>
+      <w:r>
+        <w:rPr>
+          <w:lang w:val="en-US"/>
+        </w:rPr>
+        <w:t xml:space="preserve"> come together, so they split and their tribe with them. Each went off in different directions, the continent vast enough for their own</w:t>
+      </w:r>
+      <w:r>
+        <w:rPr>
+          <w:lang w:val="en-US"/>
+        </w:rPr>
+        <w:t xml:space="preserve">, so much of </w:t>
+      </w:r>
+      <w:proofErr w:type="spellStart"/>
+      <w:r>
+        <w:rPr>
+          <w:lang w:val="en-US"/>
+        </w:rPr>
+        <w:t>Na’al</w:t>
+      </w:r>
+      <w:proofErr w:type="spellEnd"/>
+      <w:r>
+        <w:rPr>
+          <w:lang w:val="en-US"/>
+        </w:rPr>
+        <w:t xml:space="preserve"> covered by water, one they could not travers just yet. Each of the eight tribes spread and grew, so conflict had been </w:t>
       </w:r>
       <w:r>
         <w:rPr>
@@ -697,7 +865,21 @@
         <w:rPr>
           <w:lang w:val="en-US"/>
         </w:rPr>
-        <w:t>. Wars had been fought, clashes of stone and soul, bronze and soul, steel and soul.</w:t>
+        <w:t xml:space="preserve">. Wars had been fought, clashes of stone and soul, bronze and soul, </w:t>
+      </w:r>
+      <w:proofErr w:type="gramStart"/>
+      <w:r>
+        <w:rPr>
+          <w:lang w:val="en-US"/>
+        </w:rPr>
+        <w:t>steel</w:t>
+      </w:r>
+      <w:proofErr w:type="gramEnd"/>
+      <w:r>
+        <w:rPr>
+          <w:lang w:val="en-US"/>
+        </w:rPr>
+        <w:t xml:space="preserve"> and soul.</w:t>
       </w:r>
       <w:r>
         <w:rPr>
@@ -719,12 +901,14 @@
         <w:tab/>
         <w:t xml:space="preserve">The second time was to barter peace, after over three thousand rotations had passed, for they had grown tired of it all. This time </w:t>
       </w:r>
+      <w:proofErr w:type="spellStart"/>
       <w:r>
         <w:rPr>
           <w:lang w:val="en-US"/>
         </w:rPr>
         <w:t>Ethfyosh'Ikar</w:t>
       </w:r>
+      <w:proofErr w:type="spellEnd"/>
       <w:r>
         <w:rPr>
           <w:lang w:val="en-US"/>
@@ -771,7 +955,7 @@
         <w:rPr>
           <w:lang w:val="en-US"/>
         </w:rPr>
-        <w:t>immensly</w:t>
+        <w:t>immensely</w:t>
       </w:r>
       <w:r>
         <w:rPr>
@@ -779,12 +963,14 @@
         </w:rPr>
         <w:t xml:space="preserve">. </w:t>
       </w:r>
+      <w:proofErr w:type="spellStart"/>
       <w:r>
         <w:rPr>
           <w:lang w:val="en-US"/>
         </w:rPr>
         <w:t>Asarat'Rike</w:t>
       </w:r>
+      <w:proofErr w:type="spellEnd"/>
       <w:r>
         <w:rPr>
           <w:lang w:val="en-US"/>
@@ -813,7 +999,19 @@
         <w:rPr>
           <w:lang w:val="en-US"/>
         </w:rPr>
-        <w:t xml:space="preserve"> ever thoughtful</w:t>
+        <w:t xml:space="preserve"> ever </w:t>
+      </w:r>
+      <w:r>
+        <w:rPr>
+          <w:lang w:val="en-US"/>
+        </w:rPr>
+        <w:t>emphatic</w:t>
+      </w:r>
+      <w:r>
+        <w:rPr>
+          <w:lang w:val="en-US"/>
+        </w:rPr>
+        <w:t xml:space="preserve"> and thoughtful</w:t>
       </w:r>
       <w:r>
         <w:rPr>
@@ -849,7 +1047,19 @@
         <w:rPr>
           <w:lang w:val="en-US"/>
         </w:rPr>
-        <w:t xml:space="preserve"> So they marked their stake and with utmost power they split the earth and drifted them apart in big chunks of rock and soil. Eight planes instead of one.</w:t>
+        <w:t xml:space="preserve"> </w:t>
+      </w:r>
+      <w:r>
+        <w:rPr>
+          <w:lang w:val="en-US"/>
+        </w:rPr>
+        <w:t>So,</w:t>
+      </w:r>
+      <w:r>
+        <w:rPr>
+          <w:lang w:val="en-US"/>
+        </w:rPr>
+        <w:t xml:space="preserve"> they marked their stake and with utmost power they split the earth and drifted them apart in big chunks of rock and soil. Eight planes instead of one.</w:t>
       </w:r>
     </w:p>
     <w:p>
@@ -865,12 +1075,14 @@
         <w:tab/>
         <w:t xml:space="preserve">That all went well for quite some time, until they had noticed, that </w:t>
       </w:r>
+      <w:proofErr w:type="spellStart"/>
       <w:r>
         <w:rPr>
           <w:lang w:val="en-US"/>
         </w:rPr>
         <w:t>Naitro'Nai</w:t>
       </w:r>
+      <w:proofErr w:type="spellEnd"/>
       <w:r>
         <w:rPr>
           <w:lang w:val="en-US"/>
@@ -895,12 +1107,14 @@
         </w:rPr>
         <w:t xml:space="preserve"> It would regrow, only more resistant. And while the peaceful people of seven of the </w:t>
       </w:r>
+      <w:proofErr w:type="spellStart"/>
       <w:r>
         <w:rPr>
           <w:lang w:val="en-US"/>
         </w:rPr>
         <w:t>Shiof'Miari</w:t>
       </w:r>
+      <w:proofErr w:type="spellEnd"/>
       <w:r>
         <w:rPr>
           <w:lang w:val="en-US"/>
@@ -920,12 +1134,14 @@
         </w:rPr>
         <w:tab/>
       </w:r>
+      <w:proofErr w:type="spellStart"/>
       <w:r>
         <w:rPr>
           <w:lang w:val="en-US"/>
         </w:rPr>
         <w:t>Shkaratve'Kekar</w:t>
       </w:r>
+      <w:proofErr w:type="spellEnd"/>
       <w:r>
         <w:rPr>
           <w:lang w:val="en-US"/>
@@ -950,23 +1166,33 @@
         </w:rPr>
         <w:t xml:space="preserve"> </w:t>
       </w:r>
+      <w:proofErr w:type="spellStart"/>
       <w:r>
         <w:rPr>
           <w:lang w:val="en-US"/>
         </w:rPr>
         <w:t>Tekofy'Erffar</w:t>
       </w:r>
+      <w:proofErr w:type="spellEnd"/>
       <w:r>
         <w:rPr>
           <w:lang w:val="en-US"/>
         </w:rPr>
         <w:t xml:space="preserve">, </w:t>
       </w:r>
-      <w:r>
-        <w:rPr>
-          <w:lang w:val="en-US"/>
-        </w:rPr>
-        <w:t>She who Embraces</w:t>
+      <w:proofErr w:type="gramStart"/>
+      <w:r>
+        <w:rPr>
+          <w:lang w:val="en-US"/>
+        </w:rPr>
+        <w:t>She</w:t>
+      </w:r>
+      <w:proofErr w:type="gramEnd"/>
+      <w:r>
+        <w:rPr>
+          <w:lang w:val="en-US"/>
+        </w:rPr>
+        <w:t xml:space="preserve"> who Embraces</w:t>
       </w:r>
       <w:r>
         <w:rPr>
@@ -974,31 +1200,77 @@
         </w:rPr>
         <w:t xml:space="preserve">, had finished a </w:t>
       </w:r>
-      <w:r>
-        <w:rPr>
-          <w:lang w:val="en-US"/>
-        </w:rPr>
-        <w:t xml:space="preserve">Kalor'Miari </w:t>
-      </w:r>
-      <w:r>
-        <w:rPr>
-          <w:lang w:val="en-US"/>
-        </w:rPr>
-        <w:t xml:space="preserve">, a Soulcraft, a spell of old, the ones they used to create and negate, to live on for so long and be reborn. Once you had control of so many souls like </w:t>
+      <w:proofErr w:type="spellStart"/>
+      <w:proofErr w:type="gramStart"/>
+      <w:r>
+        <w:rPr>
+          <w:lang w:val="en-US"/>
+        </w:rPr>
+        <w:t>Kalor'Miari</w:t>
+      </w:r>
+      <w:proofErr w:type="spellEnd"/>
+      <w:r>
+        <w:rPr>
+          <w:lang w:val="en-US"/>
+        </w:rPr>
+        <w:t xml:space="preserve"> </w:t>
+      </w:r>
+      <w:r>
+        <w:rPr>
+          <w:lang w:val="en-US"/>
+        </w:rPr>
+        <w:t>,</w:t>
+      </w:r>
+      <w:proofErr w:type="gramEnd"/>
+      <w:r>
+        <w:rPr>
+          <w:lang w:val="en-US"/>
+        </w:rPr>
+        <w:t xml:space="preserve"> a </w:t>
+      </w:r>
+      <w:proofErr w:type="spellStart"/>
+      <w:r>
+        <w:rPr>
+          <w:lang w:val="en-US"/>
+        </w:rPr>
+        <w:t>Soulcraft</w:t>
+      </w:r>
+      <w:proofErr w:type="spellEnd"/>
+      <w:r>
+        <w:rPr>
+          <w:lang w:val="en-US"/>
+        </w:rPr>
+        <w:t xml:space="preserve">, a spell of old, the ones they used to create and negate, to live on for so long and be reborn. Once you had control of so many souls like </w:t>
       </w:r>
       <w:r>
         <w:rPr>
           <w:lang w:val="en-US"/>
         </w:rPr>
         <w:lastRenderedPageBreak/>
-        <w:t xml:space="preserve">them you were a deity in all and name. They did not know if something greater existed outside of their scope, on their world Na’al or in </w:t>
-      </w:r>
+        <w:t xml:space="preserve">them you were a deity in all and name. They did not know if something greater existed outside of their scope, on their world </w:t>
+      </w:r>
+      <w:proofErr w:type="spellStart"/>
+      <w:r>
+        <w:rPr>
+          <w:lang w:val="en-US"/>
+        </w:rPr>
+        <w:t>Na’al</w:t>
+      </w:r>
+      <w:proofErr w:type="spellEnd"/>
+      <w:r>
+        <w:rPr>
+          <w:lang w:val="en-US"/>
+        </w:rPr>
+        <w:t xml:space="preserve"> or in </w:t>
+      </w:r>
+      <w:proofErr w:type="spellStart"/>
       <w:r>
         <w:rPr>
           <w:lang w:val="en-US"/>
         </w:rPr>
         <w:t>Miar'Maelik</w:t>
       </w:r>
+      <w:proofErr w:type="spellEnd"/>
       <w:r>
         <w:rPr>
           <w:lang w:val="en-US"/>
@@ -1011,48 +1283,56 @@
         </w:rPr>
         <w:t xml:space="preserve"> So, they did what they had planned, they attacked </w:t>
       </w:r>
+      <w:proofErr w:type="spellStart"/>
       <w:r>
         <w:rPr>
           <w:lang w:val="en-US"/>
         </w:rPr>
         <w:t>Naitro'Nai</w:t>
       </w:r>
+      <w:proofErr w:type="spellEnd"/>
       <w:r>
         <w:rPr>
           <w:lang w:val="en-US"/>
         </w:rPr>
         <w:t xml:space="preserve"> as he was preparing to strike </w:t>
       </w:r>
+      <w:proofErr w:type="spellStart"/>
       <w:r>
         <w:rPr>
           <w:lang w:val="en-US"/>
         </w:rPr>
         <w:t>Irnatrav'Ara</w:t>
       </w:r>
+      <w:proofErr w:type="spellEnd"/>
       <w:r>
         <w:rPr>
           <w:lang w:val="en-US"/>
         </w:rPr>
         <w:t xml:space="preserve"> first. Thankfully they did, as he proofed a gigantic challenge for them all, more souls bound to him as they had ever seen in one place at once. Almost they would have perished, if not for </w:t>
       </w:r>
+      <w:proofErr w:type="spellStart"/>
       <w:r>
         <w:rPr>
           <w:lang w:val="en-US"/>
         </w:rPr>
         <w:t>Tekofy'Erffar</w:t>
       </w:r>
+      <w:proofErr w:type="spellEnd"/>
       <w:r>
         <w:rPr>
           <w:lang w:val="en-US"/>
         </w:rPr>
         <w:t xml:space="preserve"> and her spell, binding </w:t>
       </w:r>
+      <w:proofErr w:type="spellStart"/>
       <w:r>
         <w:rPr>
           <w:lang w:val="en-US"/>
         </w:rPr>
         <w:t>Naitro'Nai</w:t>
       </w:r>
+      <w:proofErr w:type="spellEnd"/>
       <w:r>
         <w:rPr>
           <w:lang w:val="en-US"/>
@@ -1072,24 +1352,42 @@
         </w:rPr>
         <w:tab/>
       </w:r>
+      <w:proofErr w:type="spellStart"/>
       <w:r>
         <w:rPr>
           <w:lang w:val="en-US"/>
         </w:rPr>
         <w:t>Shiofthu'Mi</w:t>
       </w:r>
-      <w:r>
-        <w:rPr>
-          <w:lang w:val="en-US"/>
-        </w:rPr>
-        <w:t xml:space="preserve"> rose through the air, higher and higher, a cloud of </w:t>
-      </w:r>
+      <w:proofErr w:type="spellEnd"/>
+      <w:r>
+        <w:rPr>
+          <w:lang w:val="en-US"/>
+        </w:rPr>
+        <w:t xml:space="preserve"> rose through the air, </w:t>
+      </w:r>
+      <w:proofErr w:type="gramStart"/>
+      <w:r>
+        <w:rPr>
+          <w:lang w:val="en-US"/>
+        </w:rPr>
+        <w:t>higher and higher</w:t>
+      </w:r>
+      <w:proofErr w:type="gramEnd"/>
+      <w:r>
+        <w:rPr>
+          <w:lang w:val="en-US"/>
+        </w:rPr>
+        <w:t xml:space="preserve">, a cloud of </w:t>
+      </w:r>
+      <w:proofErr w:type="spellStart"/>
       <w:r>
         <w:rPr>
           <w:lang w:val="en-US"/>
         </w:rPr>
         <w:t>steamlike</w:t>
       </w:r>
+      <w:proofErr w:type="spellEnd"/>
       <w:r>
         <w:rPr>
           <w:lang w:val="en-US"/>
@@ -1108,12 +1406,14 @@
         </w:rPr>
         <w:t xml:space="preserve"> She had entered </w:t>
       </w:r>
+      <w:proofErr w:type="spellStart"/>
       <w:r>
         <w:rPr>
           <w:lang w:val="en-US"/>
         </w:rPr>
         <w:t>Miar'Maelik</w:t>
       </w:r>
+      <w:proofErr w:type="spellEnd"/>
       <w:r>
         <w:rPr>
           <w:lang w:val="en-US"/>
@@ -1138,24 +1438,28 @@
         </w:rPr>
         <w:t xml:space="preserve">, encompassing the horizon from under and above. Streaks of a muddy brown flowing on its surface, the white it had once held stained and broken. </w:t>
       </w:r>
+      <w:proofErr w:type="spellStart"/>
       <w:r>
         <w:rPr>
           <w:lang w:val="en-US"/>
         </w:rPr>
         <w:t>Naitro'Nai</w:t>
       </w:r>
+      <w:proofErr w:type="spellEnd"/>
       <w:r>
         <w:rPr>
           <w:lang w:val="en-US"/>
         </w:rPr>
         <w:t xml:space="preserve"> stirred on and on, his Fury showing in a feeling of freezing stings to </w:t>
       </w:r>
+      <w:proofErr w:type="spellStart"/>
       <w:r>
         <w:rPr>
           <w:lang w:val="en-US"/>
         </w:rPr>
         <w:t>Shiofthu'Mi</w:t>
       </w:r>
+      <w:proofErr w:type="spellEnd"/>
       <w:r>
         <w:rPr>
           <w:lang w:val="en-US"/>
@@ -1176,12 +1480,14 @@
         <w:tab/>
         <w:t xml:space="preserve">  She saw </w:t>
       </w:r>
+      <w:proofErr w:type="spellStart"/>
       <w:r>
         <w:rPr>
           <w:lang w:val="en-US"/>
         </w:rPr>
         <w:t>Shkaratve'Kekar</w:t>
       </w:r>
+      <w:proofErr w:type="spellEnd"/>
       <w:r>
         <w:rPr>
           <w:lang w:val="en-US"/>
@@ -1208,17 +1514,33 @@
         </w:rPr>
         <w:t xml:space="preserve">“You are the first to appear </w:t>
       </w:r>
+      <w:proofErr w:type="spellStart"/>
       <w:r>
         <w:rPr>
           <w:lang w:val="en-US"/>
         </w:rPr>
         <w:t>Shiofthu'Mi</w:t>
       </w:r>
-      <w:r>
-        <w:rPr>
-          <w:lang w:val="en-US"/>
-        </w:rPr>
-        <w:t>, Ish’Nai, First of All, you will be called,” he said in a booming voice, its origin not distinguishable, as if coming from all around her.</w:t>
+      <w:proofErr w:type="spellEnd"/>
+      <w:r>
+        <w:rPr>
+          <w:lang w:val="en-US"/>
+        </w:rPr>
+        <w:t xml:space="preserve">, </w:t>
+      </w:r>
+      <w:proofErr w:type="spellStart"/>
+      <w:r>
+        <w:rPr>
+          <w:lang w:val="en-US"/>
+        </w:rPr>
+        <w:t>Ish’Nai</w:t>
+      </w:r>
+      <w:proofErr w:type="spellEnd"/>
+      <w:r>
+        <w:rPr>
+          <w:lang w:val="en-US"/>
+        </w:rPr>
+        <w:t>, First of All, you will be called,” he said in a booming voice, its origin not distinguishable, as if coming from all around her.</w:t>
       </w:r>
     </w:p>
     <w:p>
@@ -1264,14 +1586,30 @@
         <w:rPr>
           <w:lang w:val="en-US"/>
         </w:rPr>
-        <w:t xml:space="preserve">“I am not decided yet, for I don’t know if we can face what </w:t>
-      </w:r>
+        <w:t xml:space="preserve">“I am not decided yet, for I </w:t>
+      </w:r>
+      <w:proofErr w:type="gramStart"/>
+      <w:r>
+        <w:rPr>
+          <w:lang w:val="en-US"/>
+        </w:rPr>
+        <w:t>don’t</w:t>
+      </w:r>
+      <w:proofErr w:type="gramEnd"/>
+      <w:r>
+        <w:rPr>
+          <w:lang w:val="en-US"/>
+        </w:rPr>
+        <w:t xml:space="preserve"> know if we can face what </w:t>
+      </w:r>
+      <w:proofErr w:type="spellStart"/>
       <w:r>
         <w:rPr>
           <w:lang w:val="en-US"/>
         </w:rPr>
         <w:t>Omofy'Olrak</w:t>
       </w:r>
+      <w:proofErr w:type="spellEnd"/>
       <w:r>
         <w:rPr>
           <w:lang w:val="en-US"/>
@@ -1310,12 +1648,14 @@
         </w:rPr>
         <w:t xml:space="preserve"> like we are now, seven instead of eight, for eternity. However, the craftiness of </w:t>
       </w:r>
+      <w:proofErr w:type="spellStart"/>
       <w:r>
         <w:rPr>
           <w:lang w:val="en-US"/>
         </w:rPr>
         <w:t>Naitro'Nai</w:t>
       </w:r>
+      <w:proofErr w:type="spellEnd"/>
       <w:r>
         <w:rPr>
           <w:lang w:val="en-US"/>
@@ -1395,7 +1735,21 @@
         <w:rPr>
           <w:lang w:val="en-US"/>
         </w:rPr>
-        <w:t>We don’t know if they are here to fight, or just livestock for his strength. But both grow, as he sucks the well of souls dry.</w:t>
+        <w:t xml:space="preserve">We </w:t>
+      </w:r>
+      <w:proofErr w:type="gramStart"/>
+      <w:r>
+        <w:rPr>
+          <w:lang w:val="en-US"/>
+        </w:rPr>
+        <w:t>don’t</w:t>
+      </w:r>
+      <w:proofErr w:type="gramEnd"/>
+      <w:r>
+        <w:rPr>
+          <w:lang w:val="en-US"/>
+        </w:rPr>
+        <w:t xml:space="preserve"> know if they are here to fight, or just livestock for his strength. But both grow, as he sucks the well of souls dry.</w:t>
       </w:r>
       <w:r>
         <w:rPr>
@@ -1417,12 +1771,14 @@
         </w:rPr>
         <w:t xml:space="preserve">“That will never happen,” </w:t>
       </w:r>
+      <w:proofErr w:type="spellStart"/>
       <w:r>
         <w:rPr>
           <w:lang w:val="en-US"/>
         </w:rPr>
         <w:t>Shiofthu'Mi</w:t>
       </w:r>
+      <w:proofErr w:type="spellEnd"/>
       <w:r>
         <w:rPr>
           <w:lang w:val="en-US"/>
@@ -1499,12 +1855,14 @@
           <w:lang w:val="en-US"/>
         </w:rPr>
       </w:pPr>
+      <w:proofErr w:type="spellStart"/>
       <w:r>
         <w:rPr>
           <w:lang w:val="en-US"/>
         </w:rPr>
         <w:t>Shkaratve'Kekar</w:t>
       </w:r>
+      <w:proofErr w:type="spellEnd"/>
       <w:r>
         <w:rPr>
           <w:lang w:val="en-US"/>
@@ -1579,41 +1937,89 @@
         </w:rPr>
         <w:t xml:space="preserve">Both waited in silence, until they felt the presence of the others approaching. </w:t>
       </w:r>
+      <w:proofErr w:type="spellStart"/>
       <w:r>
         <w:rPr>
           <w:lang w:val="en-US"/>
         </w:rPr>
         <w:t>Irnatrav'Ara</w:t>
       </w:r>
-      <w:r>
-        <w:rPr>
-          <w:lang w:val="en-US"/>
-        </w:rPr>
-        <w:t xml:space="preserve"> was next, Nir’Nai, second, ever joyous, her soul expanding and contracting, then </w:t>
-      </w:r>
+      <w:proofErr w:type="spellEnd"/>
+      <w:r>
+        <w:rPr>
+          <w:lang w:val="en-US"/>
+        </w:rPr>
+        <w:t xml:space="preserve"> was next, </w:t>
+      </w:r>
+      <w:proofErr w:type="spellStart"/>
+      <w:r>
+        <w:rPr>
+          <w:lang w:val="en-US"/>
+        </w:rPr>
+        <w:t>Nir’Nai</w:t>
+      </w:r>
+      <w:proofErr w:type="spellEnd"/>
+      <w:r>
+        <w:rPr>
+          <w:lang w:val="en-US"/>
+        </w:rPr>
+        <w:t xml:space="preserve">, second, ever joyous, her soul expanding and contracting, then </w:t>
+      </w:r>
+      <w:proofErr w:type="spellStart"/>
       <w:r>
         <w:rPr>
           <w:lang w:val="en-US"/>
         </w:rPr>
         <w:t>Asarat'Rike</w:t>
       </w:r>
-      <w:r>
-        <w:rPr>
-          <w:lang w:val="en-US"/>
-        </w:rPr>
-        <w:t xml:space="preserve">, Saa’Nai, her warmth radiating and removing the stinging cold. Fourth was </w:t>
-      </w:r>
+      <w:proofErr w:type="spellEnd"/>
+      <w:r>
+        <w:rPr>
+          <w:lang w:val="en-US"/>
+        </w:rPr>
+        <w:t xml:space="preserve">, </w:t>
+      </w:r>
+      <w:proofErr w:type="spellStart"/>
+      <w:r>
+        <w:rPr>
+          <w:lang w:val="en-US"/>
+        </w:rPr>
+        <w:t>Saa’Nai</w:t>
+      </w:r>
+      <w:proofErr w:type="spellEnd"/>
+      <w:r>
+        <w:rPr>
+          <w:lang w:val="en-US"/>
+        </w:rPr>
+        <w:t xml:space="preserve">, her warmth radiating and removing the stinging cold. Fourth was </w:t>
+      </w:r>
+      <w:proofErr w:type="spellStart"/>
       <w:r>
         <w:rPr>
           <w:lang w:val="en-US"/>
         </w:rPr>
         <w:t>Tekofy'Erffar</w:t>
       </w:r>
-      <w:r>
-        <w:rPr>
-          <w:lang w:val="en-US"/>
-        </w:rPr>
-        <w:t>, Ket’Nai the one that so often had bound them together again. After her</w:t>
+      <w:proofErr w:type="spellEnd"/>
+      <w:r>
+        <w:rPr>
+          <w:lang w:val="en-US"/>
+        </w:rPr>
+        <w:t xml:space="preserve">, </w:t>
+      </w:r>
+      <w:proofErr w:type="spellStart"/>
+      <w:r>
+        <w:rPr>
+          <w:lang w:val="en-US"/>
+        </w:rPr>
+        <w:t>Ket’Nai</w:t>
+      </w:r>
+      <w:proofErr w:type="spellEnd"/>
+      <w:r>
+        <w:rPr>
+          <w:lang w:val="en-US"/>
+        </w:rPr>
+        <w:t xml:space="preserve"> the one that so often had bound them together again. After her</w:t>
       </w:r>
       <w:r>
         <w:rPr>
@@ -1627,17 +2033,33 @@
         </w:rPr>
         <w:t xml:space="preserve"> </w:t>
       </w:r>
+      <w:proofErr w:type="spellStart"/>
       <w:r>
         <w:rPr>
           <w:lang w:val="en-US"/>
         </w:rPr>
         <w:t>Shkaratve'Kekar</w:t>
       </w:r>
-      <w:r>
-        <w:rPr>
-          <w:lang w:val="en-US"/>
-        </w:rPr>
-        <w:t xml:space="preserve"> found his resolve in their presence, becoming Kash’Nai, the fifth of All. They positioned themselves in a sphere like they had before </w:t>
+      <w:proofErr w:type="spellEnd"/>
+      <w:r>
+        <w:rPr>
+          <w:lang w:val="en-US"/>
+        </w:rPr>
+        <w:t xml:space="preserve"> found his resolve in their presence, becoming </w:t>
+      </w:r>
+      <w:proofErr w:type="spellStart"/>
+      <w:r>
+        <w:rPr>
+          <w:lang w:val="en-US"/>
+        </w:rPr>
+        <w:t>Kash’Nai</w:t>
+      </w:r>
+      <w:proofErr w:type="spellEnd"/>
+      <w:r>
+        <w:rPr>
+          <w:lang w:val="en-US"/>
+        </w:rPr>
+        <w:t xml:space="preserve">, the fifth of All. They positioned themselves in a sphere like they had before </w:t>
       </w:r>
       <w:r>
         <w:rPr>
@@ -1649,13 +2071,27 @@
         <w:rPr>
           <w:lang w:val="en-US"/>
         </w:rPr>
-        <w:t xml:space="preserve">, all </w:t>
-      </w:r>
-      <w:r>
-        <w:rPr>
-          <w:lang w:val="en-US"/>
-        </w:rPr>
-        <w:t xml:space="preserve">of its </w:t>
+        <w:t xml:space="preserve">, </w:t>
+      </w:r>
+      <w:proofErr w:type="gramStart"/>
+      <w:r>
+        <w:rPr>
+          <w:lang w:val="en-US"/>
+        </w:rPr>
+        <w:t xml:space="preserve">all </w:t>
+      </w:r>
+      <w:r>
+        <w:rPr>
+          <w:lang w:val="en-US"/>
+        </w:rPr>
+        <w:t>of</w:t>
+      </w:r>
+      <w:proofErr w:type="gramEnd"/>
+      <w:r>
+        <w:rPr>
+          <w:lang w:val="en-US"/>
+        </w:rPr>
+        <w:t xml:space="preserve"> its </w:t>
       </w:r>
       <w:r>
         <w:rPr>
@@ -1663,29 +2099,47 @@
         </w:rPr>
         <w:t xml:space="preserve">sides covered but two, the place for </w:t>
       </w:r>
+      <w:proofErr w:type="spellStart"/>
       <w:r>
         <w:rPr>
           <w:lang w:val="en-US"/>
         </w:rPr>
         <w:t>Naitro'Nai</w:t>
       </w:r>
+      <w:proofErr w:type="spellEnd"/>
       <w:r>
         <w:rPr>
           <w:lang w:val="en-US"/>
         </w:rPr>
         <w:t xml:space="preserve"> replaced long ago. And soon the last figures appeared as well, </w:t>
       </w:r>
+      <w:proofErr w:type="spellStart"/>
       <w:r>
         <w:rPr>
           <w:lang w:val="en-US"/>
         </w:rPr>
         <w:t>Omofy'Olrak</w:t>
       </w:r>
-      <w:r>
-        <w:rPr>
-          <w:lang w:val="en-US"/>
-        </w:rPr>
-        <w:t xml:space="preserve">, now Mo’Nai, the matriarch of their </w:t>
+      <w:proofErr w:type="spellEnd"/>
+      <w:r>
+        <w:rPr>
+          <w:lang w:val="en-US"/>
+        </w:rPr>
+        <w:t xml:space="preserve">, now </w:t>
+      </w:r>
+      <w:proofErr w:type="spellStart"/>
+      <w:r>
+        <w:rPr>
+          <w:lang w:val="en-US"/>
+        </w:rPr>
+        <w:t>Mo’Nai</w:t>
+      </w:r>
+      <w:proofErr w:type="spellEnd"/>
+      <w:r>
+        <w:rPr>
+          <w:lang w:val="en-US"/>
+        </w:rPr>
+        <w:t xml:space="preserve">, the matriarch of their </w:t>
       </w:r>
       <w:r>
         <w:rPr>
@@ -1729,17 +2183,33 @@
         </w:rPr>
         <w:t xml:space="preserve"> And last was </w:t>
       </w:r>
+      <w:proofErr w:type="spellStart"/>
       <w:r>
         <w:rPr>
           <w:lang w:val="en-US"/>
         </w:rPr>
         <w:t>Ethfyosh'Ikar</w:t>
       </w:r>
-      <w:r>
-        <w:rPr>
-          <w:lang w:val="en-US"/>
-        </w:rPr>
-        <w:t xml:space="preserve">, hesitant as always, but careful all the same. He was now Het’Nai, the seventh and last. He measured their time, their history. He foresaw what would conspire long before they could. He always urged for progress; he always urged for action. To move forward, not stop in face of danger they did not perceive anymore. He prepared for any </w:t>
+      <w:proofErr w:type="spellEnd"/>
+      <w:r>
+        <w:rPr>
+          <w:lang w:val="en-US"/>
+        </w:rPr>
+        <w:t xml:space="preserve">, hesitant as always, but careful all the same. He was now </w:t>
+      </w:r>
+      <w:proofErr w:type="spellStart"/>
+      <w:r>
+        <w:rPr>
+          <w:lang w:val="en-US"/>
+        </w:rPr>
+        <w:t>Het’Nai</w:t>
+      </w:r>
+      <w:proofErr w:type="spellEnd"/>
+      <w:r>
+        <w:rPr>
+          <w:lang w:val="en-US"/>
+        </w:rPr>
+        <w:t xml:space="preserve">, the seventh and last. He measured their time, their history. He foresaw what would conspire long before they could. He always urged for progress; he always urged for action. To move forward, not stop in face of danger they did not perceive anymore. He prepared for any </w:t>
       </w:r>
       <w:r>
         <w:rPr>
@@ -1753,12 +2223,14 @@
         </w:rPr>
         <w:t xml:space="preserve"> it was him that </w:t>
       </w:r>
+      <w:proofErr w:type="spellStart"/>
       <w:r>
         <w:rPr>
           <w:lang w:val="en-US"/>
         </w:rPr>
         <w:t>Shiofthu'Mi</w:t>
       </w:r>
+      <w:proofErr w:type="spellEnd"/>
       <w:r>
         <w:rPr>
           <w:lang w:val="en-US"/>
@@ -1789,7 +2261,21 @@
         <w:rPr>
           <w:lang w:val="en-US"/>
         </w:rPr>
-        <w:t xml:space="preserve">They formed the sphere now fully, their souls touching without bounds, their minds one as was their spirit. They convened like this for quite some time, in human lives a year at most. But they came to a conclusion. </w:t>
+        <w:t xml:space="preserve">They formed the sphere now fully, their souls touching without bounds, their minds one as was their spirit. They convened like this for quite some time, in human lives a year at most. But they </w:t>
+      </w:r>
+      <w:proofErr w:type="gramStart"/>
+      <w:r>
+        <w:rPr>
+          <w:lang w:val="en-US"/>
+        </w:rPr>
+        <w:t>came to a conclusion</w:t>
+      </w:r>
+      <w:proofErr w:type="gramEnd"/>
+      <w:r>
+        <w:rPr>
+          <w:lang w:val="en-US"/>
+        </w:rPr>
+        <w:t xml:space="preserve">. </w:t>
       </w:r>
       <w:r>
         <w:rPr>
@@ -1827,12 +2313,14 @@
         </w:rPr>
         <w:t xml:space="preserve"> </w:t>
       </w:r>
+      <w:proofErr w:type="spellStart"/>
       <w:r>
         <w:rPr>
           <w:lang w:val="en-US"/>
         </w:rPr>
         <w:t>Naitro'Nai</w:t>
       </w:r>
+      <w:proofErr w:type="spellEnd"/>
       <w:r>
         <w:rPr>
           <w:lang w:val="en-US"/>

</xml_diff>